<commit_message>
Agregar propuesta de código de buenas prácticas contractuales
Co-Authored-By: Claude Opus 5.5 <noreply@anthropic.com>
Claude-Session: https://claude.ai/code/session_01MPxHATC7J23odgNHR4pRGu
</commit_message>
<xml_diff>
--- a/Portada_Grupo2.docx
+++ b/Portada_Grupo2.docx
@@ -1422,6 +1422,906 @@
           <w:lang w:val="es-ES"/>
         </w:rPr>
         <w:t xml:space="preserve"> de 2026</w:t>
+      </w:r>
+    </w:p>
+    <w:p>
+      <w:pPr>
+        <w:spacing w:before="0" w:after="240" w:line="360" w:lineRule="auto"/>
+        <w:jc w:val="center"/>
+        <w:rPr>
+          <w:rFonts w:cs="Arial"/>
+          <w:b/>
+          <w:szCs w:val="24"/>
+          <w:lang w:val="es-SV"/>
+        </w:rPr>
+      </w:pPr>
+      <w:r>
+        <w:rPr>
+          <w:rFonts w:cs="Arial"/>
+          <w:b/>
+          <w:szCs w:val="24"/>
+          <w:lang w:val="es-SV"/>
+        </w:rPr>
+        <w:br w:type="page"/>
+      </w:r>
+      <w:r>
+        <w:rPr>
+          <w:rFonts w:cs="Arial"/>
+          <w:b/>
+          <w:szCs w:val="24"/>
+          <w:lang w:val="es-SV"/>
+        </w:rPr>
+        <w:t xml:space="preserve">PROPUESTA: CÓDIGO DE BUENAS PRÁCTICAS CONTRACTUALES DE LA EMPRESA HACIA EL CONSUMIDOR</w:t>
+      </w:r>
+    </w:p>
+    <w:p>
+      <w:pPr>
+        <w:spacing w:before="240" w:after="160" w:line="360" w:lineRule="auto"/>
+        <w:jc w:val="both"/>
+        <w:rPr>
+          <w:rFonts w:cs="Arial"/>
+          <w:b/>
+          <w:szCs w:val="24"/>
+          <w:lang w:val="es-SV"/>
+        </w:rPr>
+      </w:pPr>
+      <w:r>
+        <w:rPr>
+          <w:rFonts w:cs="Arial"/>
+          <w:b/>
+          <w:szCs w:val="24"/>
+          <w:lang w:val="es-SV"/>
+        </w:rPr>
+        <w:t xml:space="preserve">Presentación</w:t>
+      </w:r>
+    </w:p>
+    <w:p>
+      <w:pPr>
+        <w:spacing w:before="0" w:after="160" w:line="360" w:lineRule="auto"/>
+        <w:jc w:val="both"/>
+        <w:rPr>
+          <w:rFonts w:cs="Arial"/>
+          <w:szCs w:val="24"/>
+          <w:lang w:val="es-SV"/>
+        </w:rPr>
+      </w:pPr>
+      <w:r>
+        <w:rPr>
+          <w:rFonts w:cs="Arial"/>
+          <w:szCs w:val="24"/>
+          <w:lang w:val="es-SV"/>
+        </w:rPr>
+        <w:t xml:space="preserve">Desde la perspectiva contractual, la relación entre la empresa y el consumidor es un acuerdo voluntario en el que ambas partes adquieren derechos y obligaciones. Sin embargo, en la práctica el consumidor suele encontrarse en desventaja frente a la empresa, ya que posee menos información, menos poder de negociación y, en muchos casos, condiciones de vulnerabilidad. Por ello, el presente código propone un conjunto de compromisos éticos que toda empresa debería asumir para que esa relación sea justa, transparente y respetuosa con el consumidor.</w:t>
+      </w:r>
+    </w:p>
+    <w:p>
+      <w:pPr>
+        <w:spacing w:before="240" w:after="160" w:line="360" w:lineRule="auto"/>
+        <w:jc w:val="both"/>
+        <w:rPr>
+          <w:rFonts w:cs="Arial"/>
+          <w:b/>
+          <w:szCs w:val="24"/>
+          <w:lang w:val="es-SV"/>
+        </w:rPr>
+      </w:pPr>
+      <w:r>
+        <w:rPr>
+          <w:rFonts w:cs="Arial"/>
+          <w:b/>
+          <w:szCs w:val="24"/>
+          <w:lang w:val="es-SV"/>
+        </w:rPr>
+        <w:t xml:space="preserve">Objetivo</w:t>
+      </w:r>
+    </w:p>
+    <w:p>
+      <w:pPr>
+        <w:spacing w:before="0" w:after="160" w:line="360" w:lineRule="auto"/>
+        <w:jc w:val="both"/>
+        <w:rPr>
+          <w:rFonts w:cs="Arial"/>
+          <w:szCs w:val="24"/>
+          <w:lang w:val="es-SV"/>
+        </w:rPr>
+      </w:pPr>
+      <w:r>
+        <w:rPr>
+          <w:rFonts w:cs="Arial"/>
+          <w:szCs w:val="24"/>
+          <w:lang w:val="es-SV"/>
+        </w:rPr>
+        <w:t xml:space="preserve">Establecer lineamientos éticos que orienten la conducta de la empresa, y en especial de sus áreas de producción, ventas y marketing, para garantizar el cumplimiento de sus obligaciones hacia los consumidores y fortalecer la confianza en el mercado.</w:t>
+      </w:r>
+    </w:p>
+    <w:p>
+      <w:pPr>
+        <w:spacing w:before="240" w:after="160" w:line="360" w:lineRule="auto"/>
+        <w:jc w:val="both"/>
+        <w:rPr>
+          <w:rFonts w:cs="Arial"/>
+          <w:b/>
+          <w:szCs w:val="24"/>
+          <w:lang w:val="es-SV"/>
+        </w:rPr>
+      </w:pPr>
+      <w:r>
+        <w:rPr>
+          <w:rFonts w:cs="Arial"/>
+          <w:b/>
+          <w:szCs w:val="24"/>
+          <w:lang w:val="es-SV"/>
+        </w:rPr>
+        <w:t xml:space="preserve">Alcance</w:t>
+      </w:r>
+    </w:p>
+    <w:p>
+      <w:pPr>
+        <w:spacing w:before="0" w:after="160" w:line="360" w:lineRule="auto"/>
+        <w:jc w:val="both"/>
+        <w:rPr>
+          <w:rFonts w:cs="Arial"/>
+          <w:szCs w:val="24"/>
+          <w:lang w:val="es-SV"/>
+        </w:rPr>
+      </w:pPr>
+      <w:r>
+        <w:rPr>
+          <w:rFonts w:cs="Arial"/>
+          <w:szCs w:val="24"/>
+          <w:lang w:val="es-SV"/>
+        </w:rPr>
+        <w:t xml:space="preserve">Este código aplica a todos los miembros de la empresa: directivos, personal de producción, ventas, atención al cliente, publicidad y marketing, así como a los proveedores y distribuidores que actúen en nombre de ella.</w:t>
+      </w:r>
+    </w:p>
+    <w:p>
+      <w:pPr>
+        <w:spacing w:before="240" w:after="160" w:line="360" w:lineRule="auto"/>
+        <w:jc w:val="both"/>
+        <w:rPr>
+          <w:rFonts w:cs="Arial"/>
+          <w:b/>
+          <w:szCs w:val="24"/>
+          <w:lang w:val="es-SV"/>
+        </w:rPr>
+      </w:pPr>
+      <w:r>
+        <w:rPr>
+          <w:rFonts w:cs="Arial"/>
+          <w:b/>
+          <w:szCs w:val="24"/>
+          <w:lang w:val="es-SV"/>
+        </w:rPr>
+        <w:t xml:space="preserve">Capítulo I. Obligación de cumplir</w:t>
+      </w:r>
+    </w:p>
+    <w:p>
+      <w:pPr>
+        <w:spacing w:before="0" w:after="160" w:line="360" w:lineRule="auto"/>
+        <w:jc w:val="both"/>
+        <w:rPr>
+          <w:rFonts w:cs="Arial"/>
+          <w:szCs w:val="24"/>
+          <w:lang w:val="es-SV"/>
+        </w:rPr>
+      </w:pPr>
+      <w:r>
+        <w:rPr>
+          <w:rFonts w:cs="Arial"/>
+          <w:b/>
+          <w:szCs w:val="24"/>
+          <w:lang w:val="es-SV"/>
+        </w:rPr>
+        <w:t xml:space="preserve">Artículo 1. </w:t>
+      </w:r>
+      <w:r>
+        <w:rPr>
+          <w:rFonts w:cs="Arial"/>
+          <w:szCs w:val="24"/>
+          <w:lang w:val="es-SV"/>
+        </w:rPr>
+        <w:t xml:space="preserve">La empresa entregará el producto o servicio tal como fue ofrecido, respetando la calidad, cantidad, características, precio y tiempo de entrega acordados.</w:t>
+      </w:r>
+    </w:p>
+    <w:p>
+      <w:pPr>
+        <w:spacing w:before="0" w:after="160" w:line="360" w:lineRule="auto"/>
+        <w:jc w:val="both"/>
+        <w:rPr>
+          <w:rFonts w:cs="Arial"/>
+          <w:szCs w:val="24"/>
+          <w:lang w:val="es-SV"/>
+        </w:rPr>
+      </w:pPr>
+      <w:r>
+        <w:rPr>
+          <w:rFonts w:cs="Arial"/>
+          <w:b/>
+          <w:szCs w:val="24"/>
+          <w:lang w:val="es-SV"/>
+        </w:rPr>
+        <w:t xml:space="preserve">Artículo 2. </w:t>
+      </w:r>
+      <w:r>
+        <w:rPr>
+          <w:rFonts w:cs="Arial"/>
+          <w:szCs w:val="24"/>
+          <w:lang w:val="es-SV"/>
+        </w:rPr>
+        <w:t xml:space="preserve">La empresa respetará las garantías ofrecidas y atenderá los reclamos de forma oportuna, sin poner trabas innecesarias al consumidor.</w:t>
+      </w:r>
+    </w:p>
+    <w:p>
+      <w:pPr>
+        <w:spacing w:before="0" w:after="160" w:line="360" w:lineRule="auto"/>
+        <w:jc w:val="both"/>
+        <w:rPr>
+          <w:rFonts w:cs="Arial"/>
+          <w:szCs w:val="24"/>
+          <w:lang w:val="es-SV"/>
+        </w:rPr>
+      </w:pPr>
+      <w:r>
+        <w:rPr>
+          <w:rFonts w:cs="Arial"/>
+          <w:b/>
+          <w:szCs w:val="24"/>
+          <w:lang w:val="es-SV"/>
+        </w:rPr>
+        <w:t xml:space="preserve">Artículo 3. </w:t>
+      </w:r>
+      <w:r>
+        <w:rPr>
+          <w:rFonts w:cs="Arial"/>
+          <w:szCs w:val="24"/>
+          <w:lang w:val="es-SV"/>
+        </w:rPr>
+        <w:t xml:space="preserve">Cuando la empresa no pueda cumplir con lo prometido, informará al consumidor de inmediato y ofrecerá la reparación, el cambio del producto o la devolución del dinero.</w:t>
+      </w:r>
+    </w:p>
+    <w:p>
+      <w:pPr>
+        <w:spacing w:before="240" w:after="160" w:line="360" w:lineRule="auto"/>
+        <w:jc w:val="both"/>
+        <w:rPr>
+          <w:rFonts w:cs="Arial"/>
+          <w:b/>
+          <w:szCs w:val="24"/>
+          <w:lang w:val="es-SV"/>
+        </w:rPr>
+      </w:pPr>
+      <w:r>
+        <w:rPr>
+          <w:rFonts w:cs="Arial"/>
+          <w:b/>
+          <w:szCs w:val="24"/>
+          <w:lang w:val="es-SV"/>
+        </w:rPr>
+        <w:t xml:space="preserve">Capítulo II. Obligación de revelar información</w:t>
+      </w:r>
+    </w:p>
+    <w:p>
+      <w:pPr>
+        <w:spacing w:before="0" w:after="160" w:line="360" w:lineRule="auto"/>
+        <w:jc w:val="both"/>
+        <w:rPr>
+          <w:rFonts w:cs="Arial"/>
+          <w:szCs w:val="24"/>
+          <w:lang w:val="es-SV"/>
+        </w:rPr>
+      </w:pPr>
+      <w:r>
+        <w:rPr>
+          <w:rFonts w:cs="Arial"/>
+          <w:b/>
+          <w:szCs w:val="24"/>
+          <w:lang w:val="es-SV"/>
+        </w:rPr>
+        <w:t xml:space="preserve">Artículo 4. </w:t>
+      </w:r>
+      <w:r>
+        <w:rPr>
+          <w:rFonts w:cs="Arial"/>
+          <w:szCs w:val="24"/>
+          <w:lang w:val="es-SV"/>
+        </w:rPr>
+        <w:t xml:space="preserve">La empresa informará de manera clara, veraz y completa sobre:</w:t>
+      </w:r>
+    </w:p>
+    <w:p>
+      <w:pPr>
+        <w:spacing w:before="0" w:after="60" w:line="360" w:lineRule="auto"/>
+        <w:ind w:left="567"/>
+        <w:jc w:val="both"/>
+        <w:rPr>
+          <w:rFonts w:cs="Arial"/>
+          <w:szCs w:val="24"/>
+          <w:lang w:val="es-SV"/>
+        </w:rPr>
+      </w:pPr>
+      <w:r>
+        <w:rPr>
+          <w:rFonts w:cs="Arial"/>
+          <w:szCs w:val="24"/>
+          <w:lang w:val="es-SV"/>
+        </w:rPr>
+        <w:t xml:space="preserve">•  El precio total del producto o servicio, incluyendo impuestos, comisiones y cargos adicionales.</w:t>
+      </w:r>
+    </w:p>
+    <w:p>
+      <w:pPr>
+        <w:spacing w:before="0" w:after="60" w:line="360" w:lineRule="auto"/>
+        <w:ind w:left="567"/>
+        <w:jc w:val="both"/>
+        <w:rPr>
+          <w:rFonts w:cs="Arial"/>
+          <w:szCs w:val="24"/>
+          <w:lang w:val="es-SV"/>
+        </w:rPr>
+      </w:pPr>
+      <w:r>
+        <w:rPr>
+          <w:rFonts w:cs="Arial"/>
+          <w:szCs w:val="24"/>
+          <w:lang w:val="es-SV"/>
+        </w:rPr>
+        <w:t xml:space="preserve">•  Las características, componentes, ingredientes y forma correcta de uso.</w:t>
+      </w:r>
+    </w:p>
+    <w:p>
+      <w:pPr>
+        <w:spacing w:before="0" w:after="60" w:line="360" w:lineRule="auto"/>
+        <w:ind w:left="567"/>
+        <w:jc w:val="both"/>
+        <w:rPr>
+          <w:rFonts w:cs="Arial"/>
+          <w:szCs w:val="24"/>
+          <w:lang w:val="es-SV"/>
+        </w:rPr>
+      </w:pPr>
+      <w:r>
+        <w:rPr>
+          <w:rFonts w:cs="Arial"/>
+          <w:szCs w:val="24"/>
+          <w:lang w:val="es-SV"/>
+        </w:rPr>
+        <w:t xml:space="preserve">•  Los riesgos para la salud o la seguridad que el producto pueda presentar.</w:t>
+      </w:r>
+    </w:p>
+    <w:p>
+      <w:pPr>
+        <w:spacing w:before="0" w:after="60" w:line="360" w:lineRule="auto"/>
+        <w:ind w:left="567"/>
+        <w:jc w:val="both"/>
+        <w:rPr>
+          <w:rFonts w:cs="Arial"/>
+          <w:szCs w:val="24"/>
+          <w:lang w:val="es-SV"/>
+        </w:rPr>
+      </w:pPr>
+      <w:r>
+        <w:rPr>
+          <w:rFonts w:cs="Arial"/>
+          <w:szCs w:val="24"/>
+          <w:lang w:val="es-SV"/>
+        </w:rPr>
+        <w:t xml:space="preserve">•  Las condiciones de la garantía, devoluciones y cancelaciones.</w:t>
+      </w:r>
+    </w:p>
+    <w:p>
+      <w:pPr>
+        <w:spacing w:before="0" w:after="160" w:line="360" w:lineRule="auto"/>
+        <w:jc w:val="both"/>
+        <w:rPr>
+          <w:rFonts w:cs="Arial"/>
+          <w:szCs w:val="24"/>
+          <w:lang w:val="es-SV"/>
+        </w:rPr>
+      </w:pPr>
+      <w:r>
+        <w:rPr>
+          <w:rFonts w:cs="Arial"/>
+          <w:b/>
+          <w:szCs w:val="24"/>
+          <w:lang w:val="es-SV"/>
+        </w:rPr>
+        <w:t xml:space="preserve">Artículo 5. </w:t>
+      </w:r>
+      <w:r>
+        <w:rPr>
+          <w:rFonts w:cs="Arial"/>
+          <w:szCs w:val="24"/>
+          <w:lang w:val="es-SV"/>
+        </w:rPr>
+        <w:t xml:space="preserve">Los contratos y condiciones de venta estarán redactados en un lenguaje sencillo y legible, sin cláusulas ocultas ni “letra pequeña” que perjudique al consumidor.</w:t>
+      </w:r>
+    </w:p>
+    <w:p>
+      <w:pPr>
+        <w:spacing w:before="240" w:after="160" w:line="360" w:lineRule="auto"/>
+        <w:jc w:val="both"/>
+        <w:rPr>
+          <w:rFonts w:cs="Arial"/>
+          <w:b/>
+          <w:szCs w:val="24"/>
+          <w:lang w:val="es-SV"/>
+        </w:rPr>
+      </w:pPr>
+      <w:r>
+        <w:rPr>
+          <w:rFonts w:cs="Arial"/>
+          <w:b/>
+          <w:szCs w:val="24"/>
+          <w:lang w:val="es-SV"/>
+        </w:rPr>
+        <w:t xml:space="preserve">Capítulo III. Obligación de no falsear</w:t>
+      </w:r>
+    </w:p>
+    <w:p>
+      <w:pPr>
+        <w:spacing w:before="0" w:after="160" w:line="360" w:lineRule="auto"/>
+        <w:jc w:val="both"/>
+        <w:rPr>
+          <w:rFonts w:cs="Arial"/>
+          <w:szCs w:val="24"/>
+          <w:lang w:val="es-SV"/>
+        </w:rPr>
+      </w:pPr>
+      <w:r>
+        <w:rPr>
+          <w:rFonts w:cs="Arial"/>
+          <w:b/>
+          <w:szCs w:val="24"/>
+          <w:lang w:val="es-SV"/>
+        </w:rPr>
+        <w:t xml:space="preserve">Artículo 6. </w:t>
+      </w:r>
+      <w:r>
+        <w:rPr>
+          <w:rFonts w:cs="Arial"/>
+          <w:szCs w:val="24"/>
+          <w:lang w:val="es-SV"/>
+        </w:rPr>
+        <w:t xml:space="preserve">La publicidad de la empresa será honesta. No se exagerarán los beneficios del producto ni se utilizarán imágenes, testimonios o datos que puedan inducir a error al consumidor.</w:t>
+      </w:r>
+    </w:p>
+    <w:p>
+      <w:pPr>
+        <w:spacing w:before="0" w:after="160" w:line="360" w:lineRule="auto"/>
+        <w:jc w:val="both"/>
+        <w:rPr>
+          <w:rFonts w:cs="Arial"/>
+          <w:szCs w:val="24"/>
+          <w:lang w:val="es-SV"/>
+        </w:rPr>
+      </w:pPr>
+      <w:r>
+        <w:rPr>
+          <w:rFonts w:cs="Arial"/>
+          <w:b/>
+          <w:szCs w:val="24"/>
+          <w:lang w:val="es-SV"/>
+        </w:rPr>
+        <w:t xml:space="preserve">Artículo 7. </w:t>
+      </w:r>
+      <w:r>
+        <w:rPr>
+          <w:rFonts w:cs="Arial"/>
+          <w:szCs w:val="24"/>
+          <w:lang w:val="es-SV"/>
+        </w:rPr>
+        <w:t xml:space="preserve">La empresa no realizará comparaciones falsas o engañosas con productos de la competencia.</w:t>
+      </w:r>
+    </w:p>
+    <w:p>
+      <w:pPr>
+        <w:spacing w:before="0" w:after="160" w:line="360" w:lineRule="auto"/>
+        <w:jc w:val="both"/>
+        <w:rPr>
+          <w:rFonts w:cs="Arial"/>
+          <w:szCs w:val="24"/>
+          <w:lang w:val="es-SV"/>
+        </w:rPr>
+      </w:pPr>
+      <w:r>
+        <w:rPr>
+          <w:rFonts w:cs="Arial"/>
+          <w:b/>
+          <w:szCs w:val="24"/>
+          <w:lang w:val="es-SV"/>
+        </w:rPr>
+        <w:t xml:space="preserve">Artículo 8. </w:t>
+      </w:r>
+      <w:r>
+        <w:rPr>
+          <w:rFonts w:cs="Arial"/>
+          <w:szCs w:val="24"/>
+          <w:lang w:val="es-SV"/>
+        </w:rPr>
+        <w:t xml:space="preserve">Las ofertas y promociones se cumplirán en los términos anunciados y se indicará con claridad su vigencia y sus condiciones.</w:t>
+      </w:r>
+    </w:p>
+    <w:p>
+      <w:pPr>
+        <w:spacing w:before="240" w:after="160" w:line="360" w:lineRule="auto"/>
+        <w:jc w:val="both"/>
+        <w:rPr>
+          <w:rFonts w:cs="Arial"/>
+          <w:b/>
+          <w:szCs w:val="24"/>
+          <w:lang w:val="es-SV"/>
+        </w:rPr>
+      </w:pPr>
+      <w:r>
+        <w:rPr>
+          <w:rFonts w:cs="Arial"/>
+          <w:b/>
+          <w:szCs w:val="24"/>
+          <w:lang w:val="es-SV"/>
+        </w:rPr>
+        <w:t xml:space="preserve">Capítulo IV. Obligación de no coaccionar</w:t>
+      </w:r>
+    </w:p>
+    <w:p>
+      <w:pPr>
+        <w:spacing w:before="0" w:after="160" w:line="360" w:lineRule="auto"/>
+        <w:jc w:val="both"/>
+        <w:rPr>
+          <w:rFonts w:cs="Arial"/>
+          <w:szCs w:val="24"/>
+          <w:lang w:val="es-SV"/>
+        </w:rPr>
+      </w:pPr>
+      <w:r>
+        <w:rPr>
+          <w:rFonts w:cs="Arial"/>
+          <w:b/>
+          <w:szCs w:val="24"/>
+          <w:lang w:val="es-SV"/>
+        </w:rPr>
+        <w:t xml:space="preserve">Artículo 9. </w:t>
+      </w:r>
+      <w:r>
+        <w:rPr>
+          <w:rFonts w:cs="Arial"/>
+          <w:szCs w:val="24"/>
+          <w:lang w:val="es-SV"/>
+        </w:rPr>
+        <w:t xml:space="preserve">La empresa no utilizará técnicas de venta que ejerzan presión indebida sobre el consumidor, como falsas urgencias (“solo por hoy”, “últimas unidades”) cuando no sean ciertas.</w:t>
+      </w:r>
+    </w:p>
+    <w:p>
+      <w:pPr>
+        <w:spacing w:before="0" w:after="160" w:line="360" w:lineRule="auto"/>
+        <w:jc w:val="both"/>
+        <w:rPr>
+          <w:rFonts w:cs="Arial"/>
+          <w:szCs w:val="24"/>
+          <w:lang w:val="es-SV"/>
+        </w:rPr>
+      </w:pPr>
+      <w:r>
+        <w:rPr>
+          <w:rFonts w:cs="Arial"/>
+          <w:b/>
+          <w:szCs w:val="24"/>
+          <w:lang w:val="es-SV"/>
+        </w:rPr>
+        <w:t xml:space="preserve">Artículo 10. </w:t>
+      </w:r>
+      <w:r>
+        <w:rPr>
+          <w:rFonts w:cs="Arial"/>
+          <w:szCs w:val="24"/>
+          <w:lang w:val="es-SV"/>
+        </w:rPr>
+        <w:t xml:space="preserve">La empresa no se aprovechará de la falta de conocimiento, la necesidad, la edad o cualquier otra condición de vulnerabilidad del consumidor para obtener un beneficio.</w:t>
+      </w:r>
+    </w:p>
+    <w:p>
+      <w:pPr>
+        <w:spacing w:before="0" w:after="160" w:line="360" w:lineRule="auto"/>
+        <w:jc w:val="both"/>
+        <w:rPr>
+          <w:rFonts w:cs="Arial"/>
+          <w:szCs w:val="24"/>
+          <w:lang w:val="es-SV"/>
+        </w:rPr>
+      </w:pPr>
+      <w:r>
+        <w:rPr>
+          <w:rFonts w:cs="Arial"/>
+          <w:b/>
+          <w:szCs w:val="24"/>
+          <w:lang w:val="es-SV"/>
+        </w:rPr>
+        <w:t xml:space="preserve">Artículo 11. </w:t>
+      </w:r>
+      <w:r>
+        <w:rPr>
+          <w:rFonts w:cs="Arial"/>
+          <w:szCs w:val="24"/>
+          <w:lang w:val="es-SV"/>
+        </w:rPr>
+        <w:t xml:space="preserve">La empresa respetará el derecho del consumidor a reflexionar su compra y a retractarse en los plazos que establece la ley.</w:t>
+      </w:r>
+    </w:p>
+    <w:p>
+      <w:pPr>
+        <w:spacing w:before="240" w:after="160" w:line="360" w:lineRule="auto"/>
+        <w:jc w:val="both"/>
+        <w:rPr>
+          <w:rFonts w:cs="Arial"/>
+          <w:b/>
+          <w:szCs w:val="24"/>
+          <w:lang w:val="es-SV"/>
+        </w:rPr>
+      </w:pPr>
+      <w:r>
+        <w:rPr>
+          <w:rFonts w:cs="Arial"/>
+          <w:b/>
+          <w:szCs w:val="24"/>
+          <w:lang w:val="es-SV"/>
+        </w:rPr>
+        <w:t xml:space="preserve">Capítulo V. Respuesta a los problemas de la teoría contractual</w:t>
+      </w:r>
+    </w:p>
+    <w:p>
+      <w:pPr>
+        <w:spacing w:before="0" w:after="160" w:line="360" w:lineRule="auto"/>
+        <w:jc w:val="both"/>
+        <w:rPr>
+          <w:rFonts w:cs="Arial"/>
+          <w:szCs w:val="24"/>
+          <w:lang w:val="es-SV"/>
+        </w:rPr>
+      </w:pPr>
+      <w:r>
+        <w:rPr>
+          <w:rFonts w:cs="Arial"/>
+          <w:b/>
+          <w:szCs w:val="24"/>
+          <w:lang w:val="es-SV"/>
+        </w:rPr>
+        <w:t xml:space="preserve">Artículo 12. </w:t>
+      </w:r>
+      <w:r>
+        <w:rPr>
+          <w:rFonts w:cs="Arial"/>
+          <w:szCs w:val="24"/>
+          <w:lang w:val="es-SV"/>
+        </w:rPr>
+        <w:t xml:space="preserve">La empresa reconoce que la teoría contractual supone una igualdad entre las partes que no siempre existe. Por ello, se compromete a proteger los intereses del consumidor aun cuando el contrato no lo exija expresamente.</w:t>
+      </w:r>
+    </w:p>
+    <w:p>
+      <w:pPr>
+        <w:spacing w:before="0" w:after="160" w:line="360" w:lineRule="auto"/>
+        <w:jc w:val="both"/>
+        <w:rPr>
+          <w:rFonts w:cs="Arial"/>
+          <w:szCs w:val="24"/>
+          <w:lang w:val="es-SV"/>
+        </w:rPr>
+      </w:pPr>
+      <w:r>
+        <w:rPr>
+          <w:rFonts w:cs="Arial"/>
+          <w:b/>
+          <w:szCs w:val="24"/>
+          <w:lang w:val="es-SV"/>
+        </w:rPr>
+        <w:t xml:space="preserve">Artículo 13. </w:t>
+      </w:r>
+      <w:r>
+        <w:rPr>
+          <w:rFonts w:cs="Arial"/>
+          <w:szCs w:val="24"/>
+          <w:lang w:val="es-SV"/>
+        </w:rPr>
+        <w:t xml:space="preserve">La empresa asumirá la responsabilidad por los daños que sus productos puedan causar, aunque el consumidor no los haya previsto al momento de la compra.</w:t>
+      </w:r>
+    </w:p>
+    <w:p>
+      <w:pPr>
+        <w:spacing w:before="0" w:after="160" w:line="360" w:lineRule="auto"/>
+        <w:jc w:val="both"/>
+        <w:rPr>
+          <w:rFonts w:cs="Arial"/>
+          <w:szCs w:val="24"/>
+          <w:lang w:val="es-SV"/>
+        </w:rPr>
+      </w:pPr>
+      <w:r>
+        <w:rPr>
+          <w:rFonts w:cs="Arial"/>
+          <w:b/>
+          <w:szCs w:val="24"/>
+          <w:lang w:val="es-SV"/>
+        </w:rPr>
+        <w:t xml:space="preserve">Artículo 14. </w:t>
+      </w:r>
+      <w:r>
+        <w:rPr>
+          <w:rFonts w:cs="Arial"/>
+          <w:szCs w:val="24"/>
+          <w:lang w:val="es-SV"/>
+        </w:rPr>
+        <w:t xml:space="preserve">La empresa prestará especial atención a los consumidores más vulnerables, como niños, personas adultas mayores y personas con poca información o recursos.</w:t>
+      </w:r>
+    </w:p>
+    <w:p>
+      <w:pPr>
+        <w:spacing w:before="240" w:after="160" w:line="360" w:lineRule="auto"/>
+        <w:jc w:val="both"/>
+        <w:rPr>
+          <w:rFonts w:cs="Arial"/>
+          <w:b/>
+          <w:szCs w:val="24"/>
+          <w:lang w:val="es-SV"/>
+        </w:rPr>
+      </w:pPr>
+      <w:r>
+        <w:rPr>
+          <w:rFonts w:cs="Arial"/>
+          <w:b/>
+          <w:szCs w:val="24"/>
+          <w:lang w:val="es-SV"/>
+        </w:rPr>
+        <w:t xml:space="preserve">Capítulo VI. Mecanismos de aplicación</w:t>
+      </w:r>
+    </w:p>
+    <w:p>
+      <w:pPr>
+        <w:spacing w:before="0" w:after="160" w:line="360" w:lineRule="auto"/>
+        <w:jc w:val="both"/>
+        <w:rPr>
+          <w:rFonts w:cs="Arial"/>
+          <w:szCs w:val="24"/>
+          <w:lang w:val="es-SV"/>
+        </w:rPr>
+      </w:pPr>
+      <w:r>
+        <w:rPr>
+          <w:rFonts w:cs="Arial"/>
+          <w:b/>
+          <w:szCs w:val="24"/>
+          <w:lang w:val="es-SV"/>
+        </w:rPr>
+        <w:t xml:space="preserve">Artículo 15. </w:t>
+      </w:r>
+      <w:r>
+        <w:rPr>
+          <w:rFonts w:cs="Arial"/>
+          <w:szCs w:val="24"/>
+          <w:lang w:val="es-SV"/>
+        </w:rPr>
+        <w:t xml:space="preserve">La empresa contará con un canal accesible de quejas y sugerencias, y dará respuesta a cada caso en un plazo razonable.</w:t>
+      </w:r>
+    </w:p>
+    <w:p>
+      <w:pPr>
+        <w:spacing w:before="0" w:after="160" w:line="360" w:lineRule="auto"/>
+        <w:jc w:val="both"/>
+        <w:rPr>
+          <w:rFonts w:cs="Arial"/>
+          <w:szCs w:val="24"/>
+          <w:lang w:val="es-SV"/>
+        </w:rPr>
+      </w:pPr>
+      <w:r>
+        <w:rPr>
+          <w:rFonts w:cs="Arial"/>
+          <w:b/>
+          <w:szCs w:val="24"/>
+          <w:lang w:val="es-SV"/>
+        </w:rPr>
+        <w:t xml:space="preserve">Artículo 16. </w:t>
+      </w:r>
+      <w:r>
+        <w:rPr>
+          <w:rFonts w:cs="Arial"/>
+          <w:szCs w:val="24"/>
+          <w:lang w:val="es-SV"/>
+        </w:rPr>
+        <w:t xml:space="preserve">El personal de ventas, atención al cliente y marketing recibirá capacitación periódica sobre este código y sobre los derechos del consumidor.</w:t>
+      </w:r>
+    </w:p>
+    <w:p>
+      <w:pPr>
+        <w:spacing w:before="0" w:after="160" w:line="360" w:lineRule="auto"/>
+        <w:jc w:val="both"/>
+        <w:rPr>
+          <w:rFonts w:cs="Arial"/>
+          <w:szCs w:val="24"/>
+          <w:lang w:val="es-SV"/>
+        </w:rPr>
+      </w:pPr>
+      <w:r>
+        <w:rPr>
+          <w:rFonts w:cs="Arial"/>
+          <w:b/>
+          <w:szCs w:val="24"/>
+          <w:lang w:val="es-SV"/>
+        </w:rPr>
+        <w:t xml:space="preserve">Artículo 17. </w:t>
+      </w:r>
+      <w:r>
+        <w:rPr>
+          <w:rFonts w:cs="Arial"/>
+          <w:szCs w:val="24"/>
+          <w:lang w:val="es-SV"/>
+        </w:rPr>
+        <w:t xml:space="preserve">La empresa actuará en cumplimiento de la Ley de Protección al Consumidor de El Salvador y colaborará con la Defensoría del Consumidor en la solución de controversias.</w:t>
+      </w:r>
+    </w:p>
+    <w:p>
+      <w:pPr>
+        <w:spacing w:before="0" w:after="160" w:line="360" w:lineRule="auto"/>
+        <w:jc w:val="both"/>
+        <w:rPr>
+          <w:rFonts w:cs="Arial"/>
+          <w:szCs w:val="24"/>
+          <w:lang w:val="es-SV"/>
+        </w:rPr>
+      </w:pPr>
+      <w:r>
+        <w:rPr>
+          <w:rFonts w:cs="Arial"/>
+          <w:b/>
+          <w:szCs w:val="24"/>
+          <w:lang w:val="es-SV"/>
+        </w:rPr>
+        <w:t xml:space="preserve">Artículo 18. </w:t>
+      </w:r>
+      <w:r>
+        <w:rPr>
+          <w:rFonts w:cs="Arial"/>
+          <w:szCs w:val="24"/>
+          <w:lang w:val="es-SV"/>
+        </w:rPr>
+        <w:t xml:space="preserve">El incumplimiento de este código por parte de cualquier miembro de la empresa será evaluado y sancionado de acuerdo con el reglamento interno.</w:t>
+      </w:r>
+    </w:p>
+    <w:p>
+      <w:pPr>
+        <w:spacing w:before="240" w:after="160" w:line="360" w:lineRule="auto"/>
+        <w:jc w:val="both"/>
+        <w:rPr>
+          <w:rFonts w:cs="Arial"/>
+          <w:b/>
+          <w:szCs w:val="24"/>
+          <w:lang w:val="es-SV"/>
+        </w:rPr>
+      </w:pPr>
+      <w:r>
+        <w:rPr>
+          <w:rFonts w:cs="Arial"/>
+          <w:b/>
+          <w:szCs w:val="24"/>
+          <w:lang w:val="es-SV"/>
+        </w:rPr>
+        <w:t xml:space="preserve">Conclusión</w:t>
+      </w:r>
+    </w:p>
+    <w:p>
+      <w:pPr>
+        <w:spacing w:before="0" w:after="160" w:line="360" w:lineRule="auto"/>
+        <w:jc w:val="both"/>
+        <w:rPr>
+          <w:rFonts w:cs="Arial"/>
+          <w:szCs w:val="24"/>
+          <w:lang w:val="es-SV"/>
+        </w:rPr>
+      </w:pPr>
+      <w:r>
+        <w:rPr>
+          <w:rFonts w:cs="Arial"/>
+          <w:szCs w:val="24"/>
+          <w:lang w:val="es-SV"/>
+        </w:rPr>
+        <w:t xml:space="preserve">La relación entre la empresa y el consumidor no debe verse únicamente como un intercambio comercial, sino como un compromiso ético. Cumplir lo prometido, informar con la verdad, no engañar y no presionar al consumidor son obligaciones que, además de ser justas, generan confianza, fidelidad de los clientes y una mejor reputación para la empresa en el largo plazo.</w:t>
       </w:r>
     </w:p>
     <w:sectPr>

</xml_diff>

<commit_message>
Incluir la propuesta en el tema de la portada
Co-Authored-By: Claude Opus 5.5 <noreply@anthropic.com>
Claude-Session: https://claude.ai/code/session_01MPxHATC7J23odgNHR4pRGu
</commit_message>
<xml_diff>
--- a/Portada_Grupo2.docx
+++ b/Portada_Grupo2.docx
@@ -326,7 +326,7 @@
           <w:rFonts w:cs="Arial"/>
           <w:lang w:val="es-SV"/>
         </w:rPr>
-        <w:t>“La perspectiva de contrato de las obligaciones de las</w:t>
+        <w:t>“La perspectiva de contrato de las obligaciones de las empresas hacia los</w:t>
       </w:r>
     </w:p>
     <w:p>
@@ -343,7 +343,7 @@
           <w:rFonts w:cs="Arial"/>
           <w:lang w:val="es-SV"/>
         </w:rPr>
-        <w:t>empresas hacia los consumidores”</w:t>
+        <w:t>consumidores y propuesta de código de buenas prácticas contractuales”</w:t>
       </w:r>
     </w:p>
     <w:p>

</xml_diff>

<commit_message>
Redactar el tema de la portada como tema de investigación aplicada
Co-Authored-By: Claude Opus 5.5 <noreply@anthropic.com>
Claude-Session: https://claude.ai/code/session_01MPxHATC7J23odgNHR4pRGu
</commit_message>
<xml_diff>
--- a/Portada_Grupo2.docx
+++ b/Portada_Grupo2.docx
@@ -326,7 +326,7 @@
           <w:rFonts w:cs="Arial"/>
           <w:lang w:val="es-SV"/>
         </w:rPr>
-        <w:t>“La perspectiva de contrato de las obligaciones de las empresas hacia los</w:t>
+        <w:t>“Análisis de las obligaciones contractuales de las empresas hacia los</w:t>
       </w:r>
     </w:p>
     <w:p>
@@ -343,7 +343,7 @@
           <w:rFonts w:cs="Arial"/>
           <w:lang w:val="es-SV"/>
         </w:rPr>
-        <w:t>consumidores y propuesta de código de buenas prácticas contractuales”</w:t>
+        <w:t>consumidores en San Salvador y propuesta de un código de buenas prácticas”</w:t>
       </w:r>
     </w:p>
     <w:p>

</xml_diff>